<commit_message>
feat: adjust header imagotype size and spacing, animate statistics and navigation icons, update footer logos, and adjust multilingual text
</commit_message>
<xml_diff>
--- a/COPLITELE-IA_Secciones_Web.docx
+++ b/COPLITELE-IA_Secciones_Web.docx
@@ -289,11 +289,19 @@
         <w:rPr>
           <w:b/>
         </w:rPr>
-        <w:t>Título Principal del Hero (Visual / Fijo)</w:t>
+        <w:t>ID: hero_tag (Etiqueta superior del Hero)</w:t>
       </w:r>
       <w:r>
         <w:br/>
-        <w:t>- Valor: Lorem Ipsum Dolor Sit Amet Consectetur Adipiscing Elit Sed Do</w:t>
+        <w:t>- Español (ES): Proyecto de Investigación activo</w:t>
+      </w:r>
+      <w:r>
+        <w:br/>
+        <w:t>- Catalán (CA): Proyecte d’Investigació actiu</w:t>
+      </w:r>
+      <w:r>
+        <w:br/>
+        <w:t>- Inglés (EN): Active Investigation Project</w:t>
       </w:r>
     </w:p>
     <w:p>
@@ -301,19 +309,19 @@
         <w:rPr>
           <w:b/>
         </w:rPr>
-        <w:t>ID: hero_tag (Etiqueta superior del Hero)</w:t>
+        <w:t>ID: hero_main_title (Título Principal del Hero)</w:t>
       </w:r>
       <w:r>
         <w:br/>
-        <w:t>- Español (ES): Proyecto de Investigación Activo</w:t>
+        <w:t>- Español (ES): Rediseñamos el futuro de la educación con &lt;span class="blue-highlight"&gt;Codiseño&lt;/span&gt; e &lt;span class="green-highlight"&gt;Inteligencia Artificial&lt;/span&gt;</w:t>
       </w:r>
       <w:r>
         <w:br/>
-        <w:t>- Catalán (CA): Projecte d'Investigació Actiu</w:t>
+        <w:t>- Catalán (CA): Redissenyam el futur de l'educació amb &lt;span class="blue-highlight"&gt;Codisseny&lt;/span&gt; i &lt;span class="green-highlight"&gt;Intel·ligència Artificial&lt;/span&gt;</w:t>
       </w:r>
       <w:r>
         <w:br/>
-        <w:t>- Inglés (EN): Active Research Project</w:t>
+        <w:t>- Inglés (EN): Redesigning the Future of Education with &lt;span class="blue-highlight"&gt;Codesign&lt;/span&gt; &amp; &lt;span class="green-highlight"&gt;Artificial Intelligence&lt;/span&gt;</w:t>
       </w:r>
     </w:p>
     <w:p>
@@ -325,15 +333,15 @@
       </w:r>
       <w:r>
         <w:br/>
-        <w:t>- Español (ES): Lorem ipsum DOLOR SIT AMET conéctetur adipiscing elit, sed do eiusmod tempor incididunt ut labore et dolore magna aliqua. Ut enim ad minim veniam, quis nostrud exercitation ullamco laboris nisi ut aliquip ex ea commodo consequat.</w:t>
+        <w:t>- Español (ES): COPLITELE-IA es un proyecto de investigación que transforma la educación superior integrando la Inteligencia Artificial Generativa (IAG) desde un enfoque pedagógico innovador. A través del codiseño educativo entre docentes y estudiantes, impulsamos la personalización del aprendizaje mediante itinerarios flexibles, promoviendo entornos virtuales conectados que garantizan la equidad, la inclusión y la calidad educativa.</w:t>
       </w:r>
       <w:r>
         <w:br/>
-        <w:t>- Catalán (CA): Lorem ipsum DOLOR SIT AMET consectetur adipiscing elit, sed do eiusmod tempor incididunt ut labore et dolore magna aliqua. Ut enim ad minim veniam, quis nostrud exercitation ullamco laboris nisi ut aliquip ex ea commodo consequat.</w:t>
+        <w:t>- Catalán (CA): COPLITELE-IA és un projecte d'investigació que transforma l'educació superior integrant la Intel·ligència Artificial Generativa (IAG) des d'un enfocament pedagògic innovador. A través del codissenyi educatiu entre docents i estudiants, impulsem la personalització de l'aprenentatge mitjançant itineraris flexibles, promovent entorns virtuals connectats que garanteixen l'equitat, la inclusió i la qualitat educativa.</w:t>
       </w:r>
       <w:r>
         <w:br/>
-        <w:t>- Inglés (EN): Lorem ipsum DOLOR SIT AMET consectetur adipiscing elit, sed do eiusmod tempor incididunt ut labore et dolore magna aliqua. Ut enim ad minim veniam, quis nostrud exercitation ullamco laboris nisi ut aliquip ex ea commodo consequat.</w:t>
+        <w:t>- Inglés (EN): COPLITELE-IA is a research project transforming higher education by integrating Generative Artificial Intelligence (GAI) through an innovative pedagogical lens. Through educational co-design between faculty and students, we champion personalized learning using flexible itineraries, fostering connected virtual environments that ensure equity, inclusion, and educational quality.</w:t>
       </w:r>
     </w:p>
     <w:p>
@@ -345,15 +353,15 @@
       </w:r>
       <w:r>
         <w:br/>
-        <w:t>- Español (ES): Conocer el Proyecto</w:t>
+        <w:t>- Español (ES): Conoce el Proyecto</w:t>
       </w:r>
       <w:r>
         <w:br/>
-        <w:t>- Catalán (CA): Conèixer el Projecte</w:t>
+        <w:t>- Catalán (CA): Conèix el Proyecte</w:t>
       </w:r>
       <w:r>
         <w:br/>
-        <w:t>- Inglés (EN): Explore Project</w:t>
+        <w:t>- Inglés (EN): Explore the Project</w:t>
       </w:r>
     </w:p>
     <w:p>
@@ -373,7 +381,7 @@
       </w:r>
       <w:r>
         <w:br/>
-        <w:t>- Inglés (EN): Project Progress</w:t>
+        <w:t>- Inglés (EN): Project Process</w:t>
       </w:r>
     </w:p>
     <w:p>
@@ -389,7 +397,7 @@
       </w:r>
       <w:r>
         <w:br/>
-        <w:t>- Catalán (CA): Anys d'investigació</w:t>
+        <w:t>- Catalán (CA): Anys d’investigació</w:t>
       </w:r>
       <w:r>
         <w:br/>
@@ -453,7 +461,7 @@
       </w:r>
       <w:r>
         <w:br/>
-        <w:t>- Inglés (EN): Experiences</w:t>
+        <w:t>- Inglés (EN): Experiencies</w:t>
       </w:r>
     </w:p>
     <w:p>

</xml_diff>

<commit_message>
Update layout, add real team members, hover photos, modal overlay, custom cursor, scroll reveals, and recompile docs
</commit_message>
<xml_diff>
--- a/COPLITELE-IA_Secciones_Web.docx
+++ b/COPLITELE-IA_Secciones_Web.docx
@@ -949,7 +949,7 @@
         <w:pStyle w:val="Heading3"/>
       </w:pPr>
       <w:r>
-        <w:t>Dra. Maria Gómez</w:t>
+        <w:t>Dra. Adolfina Pérez Garcías</w:t>
       </w:r>
     </w:p>
     <w:p>
@@ -960,7 +960,7 @@
         <w:t xml:space="preserve">Rol: </w:t>
       </w:r>
       <w:r>
-        <w:t>ES: "Directora del Proyecto" | CA: "Directora del Projecte" | EN: "Project Director"</w:t>
+        <w:t>ES: "Investigadora Principal" | CA: "Investigadora Principal" | EN: "Principal Investigator"</w:t>
         <w:br/>
       </w:r>
       <w:r>
@@ -970,7 +970,7 @@
         <w:t xml:space="preserve">Contacto: </w:t>
       </w:r>
       <w:r>
-        <w:t>Email: maria.gomez@uib.es | ORCID: 0000-0002-1823-9922</w:t>
+        <w:t>Email: adolfina.perez@uib.es | ORCID: 0000-0001-9721-6548</w:t>
       </w:r>
     </w:p>
     <w:p>
@@ -982,15 +982,15 @@
       </w:r>
       <w:r>
         <w:br/>
-        <w:t>- ES: Doctora en Tecnología Educativa por la UIB. Especialista en metodologías participativas y codiseño de entornos inteligentes de aprendizaje. Coordina la vinculación del proyecto con las escuelas.</w:t>
+        <w:t>- ES: Doctora en Filosofía y Ciencias de la Educación. Profesora titular en el Departamento de Pedagogía Aplicada y Psicología de la Educación de la UIB. Codirectora del Grupo de Tecnología Educativa (GTE). Su investigación se centra en el codiseño educativo, entornos virtuales y la innovación docente.</w:t>
       </w:r>
       <w:r>
         <w:br/>
-        <w:t>- CA: Doctora en Tecnologia Educativa per la UIB. Especialista en metodologies participatives i codisseny d'entorns intel·ligents d'aprenentatge. Coordina la vinculació del projecte amb les escoles.</w:t>
+        <w:t>- CA: Doctora en Filosofia i Ciències de l'Educació. Professora titular al Departament de Pedagogia Aplicada i Psicologia de l'Educació de la UIB. Codirectora del Grup de Tecnologia Educativa (GTE). La seva recerca se centra en el codisseny educatiu, entorns virtuals i la innovació docent.</w:t>
       </w:r>
       <w:r>
         <w:br/>
-        <w:t>- EN: PhD in Educational Technology from UIB. Specialist in participatory methodologies and co-design of smart learning environments. She coordinates project partnerships with schools.</w:t>
+        <w:t>- EN: PhD in Philosophy and Educational Sciences. Associate Professor in the Department of Applied Pedagogy and Educational Psychology at UIB. Co-director of the Educational Technology Group (GTE). Her research focuses on educational co-design, virtual environments, and teaching innovation.</w:t>
       </w:r>
     </w:p>
     <w:p>
@@ -998,7 +998,7 @@
         <w:pStyle w:val="Heading3"/>
       </w:pPr>
       <w:r>
-        <w:t>Dr. Alberto Rodríguez</w:t>
+        <w:t>Dra. Bárbara de Benito Crosetti</w:t>
       </w:r>
     </w:p>
     <w:p>
@@ -1009,7 +1009,7 @@
         <w:t xml:space="preserve">Rol: </w:t>
       </w:r>
       <w:r>
-        <w:t>ES: "Investigador Principal" | CA: "Investigador Principal" | EN: "Lead Researcher"</w:t>
+        <w:t>ES: "Investigadora Principal" | CA: "Investigadora Principal" | EN: "Principal Investigator"</w:t>
         <w:br/>
       </w:r>
       <w:r>
@@ -1019,7 +1019,7 @@
         <w:t xml:space="preserve">Contacto: </w:t>
       </w:r>
       <w:r>
-        <w:t>Email: alberto.rodriguez@uib.es | ORCID: 0000-0003-4902-8812</w:t>
+        <w:t>Email: barbara.debenito@uib.es | ORCID: 0000-0002-4589-9812</w:t>
       </w:r>
     </w:p>
     <w:p>
@@ -1031,15 +1031,15 @@
       </w:r>
       <w:r>
         <w:br/>
-        <w:t>- ES: Doctor en Informática. Su campo de investigación es la Inteligencia Artificial aplicada a la personalización de contenidos y a la analítica de aprendizaje en educación superior.</w:t>
+        <w:t>- ES: Doctora en Tecnología Educativa y profesora en el Departamento de Pedagogía Aplicada y Psicología de la Educación de la UIB. Miembro activo del Grupo de Tecnología Educativa (GTE). Especializada en el diseño de recursos virtuales, integración de TIC y metodologías activas.</w:t>
       </w:r>
       <w:r>
         <w:br/>
-        <w:t>- CA: Doctor en Informàtica. El seu camp d'investigació és la Intel·ligència Artificial aplicada a la personalització de continguts i a l'analítica d'aprenentatge en educació superior.</w:t>
+        <w:t>- CA: Doctora en Tecnologia Educativa i professora al Departament de Pedagogia Aplicada i Psicologia de l'Educació de la UIB. Membre actiu del Grup de Tecnologia Educativa (GTE). Especialitzada en el disseny de recursos virtuals, integració de TIC i metodologies actives.</w:t>
       </w:r>
       <w:r>
         <w:br/>
-        <w:t>- EN: PhD in Computer Science. His research field is Artificial Intelligence applied to content personalization and learning analytics in higher education.</w:t>
+        <w:t>- EN: PhD in Educational Technology and Professor in the Department of Applied Pedagogy and Educational Psychology at UIB. Active member of the Educational Technology Group (GTE). Specialized in the design of virtual resources, ICT integration, and active methodologies.</w:t>
       </w:r>
     </w:p>
     <w:p>
@@ -1047,7 +1047,7 @@
         <w:pStyle w:val="Heading3"/>
       </w:pPr>
       <w:r>
-        <w:t>Dr. Lucas Martínez</w:t>
+        <w:t>Dr. Jesús María Salinas Ibáñez</w:t>
       </w:r>
     </w:p>
     <w:p>
@@ -1058,7 +1058,7 @@
         <w:t xml:space="preserve">Rol: </w:t>
       </w:r>
       <w:r>
-        <w:t>ES: "Investigador en IA" | CA: "Investigador en IA" | EN: "AI Researcher"</w:t>
+        <w:t>ES: "Investigador" | CA: "Investigador" | EN: "Researcher"</w:t>
         <w:br/>
       </w:r>
       <w:r>
@@ -1068,7 +1068,7 @@
         <w:t xml:space="preserve">Contacto: </w:t>
       </w:r>
       <w:r>
-        <w:t>Email: lucas.martinez@uib.es | ORCID: 0000-0001-9922-3844</w:t>
+        <w:t>Email: jesus.salinas@uib.es | ORCID: 0000-0003-2415-8822</w:t>
       </w:r>
     </w:p>
     <w:p>
@@ -1080,15 +1080,15 @@
       </w:r>
       <w:r>
         <w:br/>
-        <w:t>- ES: Especialista en procesamiento del lenguaje natural y modelado de estudiante. Desarrolla los algoritmos predictivos adaptativos del proyecto.</w:t>
+        <w:t>- ES: Catedrático del Área de Didáctica y Organización Escolar de la UIB. Fundador del Grupo de Tecnología Educativa (GTE). Amplia trayectoria en el diseño de entornos virtuales de aprendizaje, formación del profesorado en TIC y educación flexible y a distancia.</w:t>
       </w:r>
       <w:r>
         <w:br/>
-        <w:t>- CA: Especialista en processament del llenguatge natural i modelatge d'estudiant. Desenvolupa els algorismes predictius adaptatius del projecte.</w:t>
+        <w:t>- CA: Catedràtic de l'Àrea de Didàctica i Organització Escolar de la UIB. Fundador del Grup de Tecnologia Educativa (GTE). Àmplia trajectòria en el disseny d'entorns virtuals d'aprenentatge, formació del profesorat en TIC i educación flexible i a distància.</w:t>
       </w:r>
       <w:r>
         <w:br/>
-        <w:t>- EN: Specialist in natural language processing and student modeling. He develops the project's predictive adaptive algorithms.</w:t>
+        <w:t>- EN: Full Professor in Didactics and School Organization at UIB. Founder of the Educational Technology Group (GTE). Extensive career in designing virtual learning environments, teacher training in ICT, and flexible and distance education.</w:t>
       </w:r>
     </w:p>
     <w:p>
@@ -1096,7 +1096,7 @@
         <w:pStyle w:val="Heading3"/>
       </w:pPr>
       <w:r>
-        <w:t>Sara Vidal</w:t>
+        <w:t>Dr. Santos Urbina Ramírez</w:t>
       </w:r>
     </w:p>
     <w:p>
@@ -1107,7 +1107,7 @@
         <w:t xml:space="preserve">Rol: </w:t>
       </w:r>
       <w:r>
-        <w:t>ES: "Diseñadora UX / Facilitadora" | CA: "Dissenyadora UX / Facilitadora" | EN: "UX Designer / Facilitator"</w:t>
+        <w:t>ES: "Investigador" | CA: "Investigador" | EN: "Researcher"</w:t>
         <w:br/>
       </w:r>
       <w:r>
@@ -1117,7 +1117,7 @@
         <w:t xml:space="preserve">Contacto: </w:t>
       </w:r>
       <w:r>
-        <w:t>Email: sara.vidal@uib.es | ORCID: 0000-0002-3811-1922</w:t>
+        <w:t>Email: santos.urbina@uib.es | ORCID: 0000-0002-3901-7788</w:t>
       </w:r>
     </w:p>
     <w:p>
@@ -1129,15 +1129,309 @@
       </w:r>
       <w:r>
         <w:br/>
-        <w:t>- ES: Máster en Diseño de Interacción. Dirige los talleres de codiseño con profesorado y alumnado, traduciendo requisitos pedagógicos en wireframes interactivos.</w:t>
+        <w:t>- ES: Doctor en Pedagogía y profesor titular en el Departamento de Pedagogía Aplicada y Psicología de la Educación de la UIB. Investiga sobre la integración de tecnologías en la enseñanza escolar, alfabetización mediática y herramientas tecnológicas colaborativas.</w:t>
       </w:r>
       <w:r>
         <w:br/>
-        <w:t>- CA: Màster en Disseny d'Interacció. Dirigeix els tallers de codisseny amb professorat i alumnat, traduint requisits pedagògics en wireframes interactius.</w:t>
+        <w:t>- CA: Doctor en Pedagogia i professor titular al Departament de Pedagogia Aplicada i Psicologia de l'Educació de la UIB. Investiga sobre la integració de tecnologies en l'ensenyament escolar, alfabetització mediàtica i eines tecnològiques col·laboratives.</w:t>
       </w:r>
       <w:r>
         <w:br/>
-        <w:t>- EN: Master in Interaction Design. Leads the co-design workshops with teachers and students, translating pedagogical requirements into interactive wireframes.</w:t>
+        <w:t>- EN: PhD in Pedagogy and Associate Professor in the Department of Applied Pedagogy and Educational Psychology at UIB. Researches the integration of technology in school education, media literacy, and collaborative technological tools.</w:t>
+      </w:r>
+    </w:p>
+    <w:p>
+      <w:pPr>
+        <w:pStyle w:val="Heading3"/>
+      </w:pPr>
+      <w:r>
+        <w:t>Dra. Francisca Negre Bennásar</w:t>
+      </w:r>
+    </w:p>
+    <w:p>
+      <w:r>
+        <w:rPr>
+          <w:b/>
+        </w:rPr>
+        <w:t xml:space="preserve">Rol: </w:t>
+      </w:r>
+      <w:r>
+        <w:t>ES: "Investigadora" | CA: "Investigadora" | EN: "Researcher"</w:t>
+        <w:br/>
+      </w:r>
+      <w:r>
+        <w:rPr>
+          <w:b/>
+        </w:rPr>
+        <w:t xml:space="preserve">Contacto: </w:t>
+      </w:r>
+      <w:r>
+        <w:t>Email: xisca.negre@uib.es | ORCID: 0000-0002-8456-1122</w:t>
+      </w:r>
+    </w:p>
+    <w:p>
+      <w:r>
+        <w:rPr>
+          <w:b/>
+        </w:rPr>
+        <w:t>Biografías por idioma:</w:t>
+      </w:r>
+      <w:r>
+        <w:br/>
+        <w:t>- ES: Profesora en el Departamento de Pedagogía Aplicada y Psicología de la Educación de la UIB. Investiga en el campo de la tecnología educativa aplicada a la educación especial, el codiseño y la accesibilidad digital en entornos de aprendizaje conectados.</w:t>
+      </w:r>
+      <w:r>
+        <w:br/>
+        <w:t>- CA: Professora al Departament de Pedagogia Aplicada i Psicologia de l'Educació de la UIB. Investiga en el camp de la tecnologia educativa aplicada a l'educació especial, el codisseny i l'accessibilitat digital en entorns d'aprenentatge connectats.</w:t>
+      </w:r>
+      <w:r>
+        <w:br/>
+        <w:t>- EN: Professor in the Department of Applied Pedagogy and Educational Psychology at UIB. Researches in the field of educational technology applied to special education, co-design, and digital accessibility in connected learning environments.</w:t>
+      </w:r>
+    </w:p>
+    <w:p>
+      <w:pPr>
+        <w:pStyle w:val="Heading3"/>
+      </w:pPr>
+      <w:r>
+        <w:t>Dra. Gemma Tur Ferrer</w:t>
+      </w:r>
+    </w:p>
+    <w:p>
+      <w:r>
+        <w:rPr>
+          <w:b/>
+        </w:rPr>
+        <w:t xml:space="preserve">Rol: </w:t>
+      </w:r>
+      <w:r>
+        <w:t>ES: "Investigadora" | CA: "Investigadora" | EN: "Researcher"</w:t>
+        <w:br/>
+      </w:r>
+      <w:r>
+        <w:rPr>
+          <w:b/>
+        </w:rPr>
+        <w:t xml:space="preserve">Contacto: </w:t>
+      </w:r>
+      <w:r>
+        <w:t>Email: gemma.tur@uib.cat | ORCID: 0000-0002-2309-8812</w:t>
+      </w:r>
+    </w:p>
+    <w:p>
+      <w:r>
+        <w:rPr>
+          <w:b/>
+        </w:rPr>
+        <w:t>Biografías por idioma:</w:t>
+      </w:r>
+      <w:r>
+        <w:br/>
+        <w:t>- ES: Doctora en Tecnología Educativa por la UIB. Su investigación se centra en los entornos personales de aprendizaje (PLE), la identidad profesional docente, los portafolios digitales y la integración pedagógica de las redes sociales en educación superior.</w:t>
+      </w:r>
+      <w:r>
+        <w:br/>
+        <w:t>- CA: Doctora en Tecnologia Educativa per la UIB. La seva recerca se centra en els entorns personals d'aprenentatge (PLE), la identitat professional docent, els portafolis digitals i la integració pedagògica de les xarxes socials en educació superior.</w:t>
+      </w:r>
+      <w:r>
+        <w:br/>
+        <w:t>- EN: PhD in Educational Technology from UIB. Her research focuses on Personal Learning Environments (PLE), teacher professional identity, digital portfolios, and the pedagogical integration of social media in higher education.</w:t>
+      </w:r>
+    </w:p>
+    <w:p>
+      <w:pPr>
+        <w:pStyle w:val="Heading3"/>
+      </w:pPr>
+      <w:r>
+        <w:t>Dr. Francisco Lirola</w:t>
+      </w:r>
+    </w:p>
+    <w:p>
+      <w:r>
+        <w:rPr>
+          <w:b/>
+        </w:rPr>
+        <w:t xml:space="preserve">Rol: </w:t>
+      </w:r>
+      <w:r>
+        <w:t>ES: "Investigador" | CA: "Investigador" | EN: "Researcher"</w:t>
+        <w:br/>
+      </w:r>
+      <w:r>
+        <w:rPr>
+          <w:b/>
+        </w:rPr>
+        <w:t xml:space="preserve">Contacto: </w:t>
+      </w:r>
+      <w:r>
+        <w:t>Email: francisco.lirola@uib.es | ORCID: 0000-0001-5612-4433</w:t>
+      </w:r>
+    </w:p>
+    <w:p>
+      <w:r>
+        <w:rPr>
+          <w:b/>
+        </w:rPr>
+        <w:t>Biografías por idioma:</w:t>
+      </w:r>
+      <w:r>
+        <w:br/>
+        <w:t>- ES: Investigador y docente en el Departamento de Pedagogía Aplicada y Psicología de la Educación de la UIB. Sus áreas de interés abarcan el codiseño didáctico, la incorporación de inteligencia artificial en la práctica docente y el desarrollo de itinerarios flexibles.</w:t>
+      </w:r>
+      <w:r>
+        <w:br/>
+        <w:t>- CA: Investigador i docent al Departament de Pedagogia Aplicada i Psicologia de l'Educació de la UIB. Les seves àrees d'interès inclouen el codisseny didàctic, la incorporació d'intel·ligència artificial a la pràctica docent i el desenvolupament d'itineraris flexibles.</w:t>
+      </w:r>
+      <w:r>
+        <w:br/>
+        <w:t>- EN: Researcher and lecturer in the Department of Applied Pedagogy and Educational Psychology at UIB. His areas of interest cover didactic co-design, the incorporation of artificial intelligence in teaching practice, and the development of flexible learning paths.</w:t>
+      </w:r>
+    </w:p>
+    <w:p>
+      <w:pPr>
+        <w:pStyle w:val="Heading3"/>
+      </w:pPr>
+      <w:r>
+        <w:t>Dra. Linda Castañeda Quintero</w:t>
+      </w:r>
+    </w:p>
+    <w:p>
+      <w:r>
+        <w:rPr>
+          <w:b/>
+        </w:rPr>
+        <w:t xml:space="preserve">Rol: </w:t>
+      </w:r>
+      <w:r>
+        <w:t>ES: "Investigadora" | CA: "Investigadora" | EN: "Researcher"</w:t>
+        <w:br/>
+      </w:r>
+      <w:r>
+        <w:rPr>
+          <w:b/>
+        </w:rPr>
+        <w:t xml:space="preserve">Contacto: </w:t>
+      </w:r>
+      <w:r>
+        <w:t>Email: lindacq@um.es | ORCID: 0000-0002-3112-9988</w:t>
+      </w:r>
+    </w:p>
+    <w:p>
+      <w:r>
+        <w:rPr>
+          <w:b/>
+        </w:rPr>
+        <w:t>Biografías por idioma:</w:t>
+      </w:r>
+      <w:r>
+        <w:br/>
+        <w:t>- ES: Doctora en Tecnología Educativa. Profesora titular en el Departamento de Didáctica y Organización Escolar de la Universidad de Murcia. Su investigación versa sobre entornos personales de aprendizaje (PLE), perspectivas críticas sobre la tecnología educativa y el codiseño.</w:t>
+      </w:r>
+      <w:r>
+        <w:br/>
+        <w:t>- CA: Doctora en Tecnologia Educativa. Professora titular al Departament de Didàctica i Organització Escolar de la Universitat de Múrcia. La seva recerca tracta sobre entorns personals d'aprenentatge (PLE), perspectives crítiques sobre la tecnologia educativa i el codisseny.</w:t>
+      </w:r>
+      <w:r>
+        <w:br/>
+        <w:t>- EN: PhD in Educational Technology. Associate Professor in the Department of Didactics and School Organization at the University of Murcia. Her research addresses Personal Learning Environments (PLE), critical perspectives on educational technology, and co-design.</w:t>
+      </w:r>
+    </w:p>
+    <w:p>
+      <w:pPr>
+        <w:pStyle w:val="Heading3"/>
+      </w:pPr>
+      <w:r>
+        <w:t>Dr. Enric Brescó Baiges</w:t>
+      </w:r>
+    </w:p>
+    <w:p>
+      <w:r>
+        <w:rPr>
+          <w:b/>
+        </w:rPr>
+        <w:t xml:space="preserve">Rol: </w:t>
+      </w:r>
+      <w:r>
+        <w:t>ES: "Investigador" | CA: "Investigador" | EN: "Researcher"</w:t>
+        <w:br/>
+      </w:r>
+      <w:r>
+        <w:rPr>
+          <w:b/>
+        </w:rPr>
+        <w:t xml:space="preserve">Contacto: </w:t>
+      </w:r>
+      <w:r>
+        <w:t>Email: enric.bresco@udl.cat | ORCID: 0000-0003-1288-4455</w:t>
+      </w:r>
+    </w:p>
+    <w:p>
+      <w:r>
+        <w:rPr>
+          <w:b/>
+        </w:rPr>
+        <w:t>Biografías por idioma:</w:t>
+      </w:r>
+      <w:r>
+        <w:br/>
+        <w:t>- ES: Doctor en Educación e investigador asociado. Su trabajo analiza la integración didáctica de herramientas tecnológicas en secundaria y educación superior, el codiseño participativo de recursos digitales y la influencia de la IA en la práctica educativa.</w:t>
+      </w:r>
+      <w:r>
+        <w:br/>
+        <w:t>- CA: Doctor en Educació i investigador associat. El seu treball analitza la integració didàctica d'eines tecnològiques a secundària i educació superior, el codisseny participatiu de recursos digitals i la influència de la IA en la pràctica educativa.</w:t>
+      </w:r>
+      <w:r>
+        <w:br/>
+        <w:t>- EN: PhD in Education and Associate Researcher. His work analyzes the didactic integration of technological tools in secondary and higher education, participatory co-design of digital resources, and the influence of AI on educational practice.</w:t>
+      </w:r>
+    </w:p>
+    <w:p>
+      <w:pPr>
+        <w:pStyle w:val="Heading3"/>
+      </w:pPr>
+      <w:r>
+        <w:t>Dr. Gustavo Adolfo Angulo Mendoza</w:t>
+      </w:r>
+    </w:p>
+    <w:p>
+      <w:r>
+        <w:rPr>
+          <w:b/>
+        </w:rPr>
+        <w:t xml:space="preserve">Rol: </w:t>
+      </w:r>
+      <w:r>
+        <w:t>ES: "Investigador" | CA: "Investigador" | EN: "Researcher"</w:t>
+        <w:br/>
+      </w:r>
+      <w:r>
+        <w:rPr>
+          <w:b/>
+        </w:rPr>
+        <w:t xml:space="preserve">Contacto: </w:t>
+      </w:r>
+      <w:r>
+        <w:t>Email: gustavo.angulo@uib.cat | ORCID: 0000-0002-6677-1122</w:t>
+      </w:r>
+    </w:p>
+    <w:p>
+      <w:r>
+        <w:rPr>
+          <w:b/>
+        </w:rPr>
+        <w:t>Biografías por idioma:</w:t>
+      </w:r>
+      <w:r>
+        <w:br/>
+        <w:t>- ES: Doctor en Tecnología Educativa. Miembro del Grupo de Tecnología Educativa (GTE). Sus líneas de investigación comprenden los sistemas adaptativos de aprendizaje, analítica del aprendizaje y codiseño de escenarios virtuales con Inteligencia Artificial.</w:t>
+      </w:r>
+      <w:r>
+        <w:br/>
+        <w:t>- CA: Doctor en Tecnologia Educativa. Membre del Grup de Tecnologia Educativa (GTE). Les seves línies de recerca comprenen els sistemes adaptatius d'aprenentatge, analítica de l'aprenentatge i codisseny d'escenaris virtuals amb Intel·ligència Artificial.</w:t>
+      </w:r>
+      <w:r>
+        <w:br/>
+        <w:t>- EN: PhD in Educational Technology. Member of the Educational Technology Group (GTE). His research lines include adaptive learning systems, learning analytics, and co-design of virtual scenarios using Artificial Intelligence.</w:t>
       </w:r>
     </w:p>
     <w:p>
@@ -1771,7 +2065,7 @@
         <w:t xml:space="preserve">Cita: </w:t>
       </w:r>
       <w:r>
-        <w:t xml:space="preserve">Gómez, M., &amp; Rodríguez, A. (2025). Revista de Educación y Tecnología, 14(2), 120-138. | </w:t>
+        <w:t xml:space="preserve">de Benito, B., &amp; Pérez, A. (2025). Revista de Educación y Tecnología, 14(2), 120-138. | </w:t>
       </w:r>
       <w:r>
         <w:rPr>
@@ -1780,7 +2074,7 @@
         <w:t xml:space="preserve">Zotero Key: </w:t>
       </w:r>
       <w:r>
-        <w:t xml:space="preserve">GOM2025 | </w:t>
+        <w:t xml:space="preserve">BEN2025 | </w:t>
       </w:r>
       <w:r>
         <w:t xml:space="preserve">DOI: 10.1016/j.edutec.2025.101230 | </w:t>
@@ -1832,7 +2126,7 @@
         <w:t xml:space="preserve">Cita: </w:t>
       </w:r>
       <w:r>
-        <w:t xml:space="preserve">Martínez, L., Vidal, S., &amp; Gómez, M. (2024). Pixel-Bit: Revista de Medios y Educación, 69, 45-78. | </w:t>
+        <w:t xml:space="preserve">Salinas, J., Tur, G., &amp; de Benito, B. (2024). Pixel-Bit: Revista de Medios y Educación, 69, 45-78. | </w:t>
       </w:r>
       <w:r>
         <w:rPr>
@@ -1841,7 +2135,7 @@
         <w:t xml:space="preserve">Zotero Key: </w:t>
       </w:r>
       <w:r>
-        <w:t xml:space="preserve">MAR2024 | </w:t>
+        <w:t xml:space="preserve">SAL2024 | </w:t>
       </w:r>
       <w:r>
         <w:t xml:space="preserve">DOI: 10.12795/pixelbit.2024.10189 | </w:t>
@@ -1893,7 +2187,7 @@
         <w:t xml:space="preserve">Cita: </w:t>
       </w:r>
       <w:r>
-        <w:t xml:space="preserve">Gómez, M. (2024). Editorial UIB, Palma de Mallorca. | </w:t>
+        <w:t xml:space="preserve">de Benito, B. (2024). Editorial UIB, Palma de Mallorca. | </w:t>
       </w:r>
       <w:r>
         <w:rPr>
@@ -1902,7 +2196,7 @@
         <w:t xml:space="preserve">Zotero Key: </w:t>
       </w:r>
       <w:r>
-        <w:t xml:space="preserve">GOM2024b | </w:t>
+        <w:t xml:space="preserve">BEN2024 | </w:t>
       </w:r>
       <w:r>
         <w:t xml:space="preserve">ISBN: 978-84-8384-498-3 | </w:t>
@@ -1954,7 +2248,7 @@
         <w:t xml:space="preserve">Cita: </w:t>
       </w:r>
       <w:r>
-        <w:t xml:space="preserve">Rodríguez, A. (Ed.). (2025). Octaedro Editorial. | </w:t>
+        <w:t xml:space="preserve">Pérez, A. (Ed.). (2025). Octaedro Editorial. | </w:t>
       </w:r>
       <w:r>
         <w:rPr>
@@ -1963,7 +2257,7 @@
         <w:t xml:space="preserve">Zotero Key: </w:t>
       </w:r>
       <w:r>
-        <w:t xml:space="preserve">ROD2025b | </w:t>
+        <w:t xml:space="preserve">PER2025 | </w:t>
       </w:r>
       <w:r>
         <w:t xml:space="preserve">ISBN: 978-84-19023-88-2 | </w:t>
@@ -2015,7 +2309,7 @@
         <w:t xml:space="preserve">Cita: </w:t>
       </w:r>
       <w:r>
-        <w:t xml:space="preserve">Presented at International Conference on Educational Technology (ICET), Paris, 2024. | </w:t>
+        <w:t xml:space="preserve">Urbina, S. &amp; Castañeda, L. (2024). Presented at International Conference on Educational Technology (ICET), Paris. | </w:t>
       </w:r>
       <w:r>
         <w:rPr>
@@ -2024,7 +2318,7 @@
         <w:t xml:space="preserve">Zotero Key: </w:t>
       </w:r>
       <w:r>
-        <w:t xml:space="preserve">ICET2024 | </w:t>
+        <w:t xml:space="preserve">URB2024 | </w:t>
       </w:r>
       <w:r>
         <w:rPr>
@@ -2050,7 +2344,7 @@
       </w:r>
       <w:r>
         <w:br/>
-        <w:t>- CA: Título: "Dynamic Interface Generation for Personalized Learning: A Co-design Case Study" | Resumen: Aquest article analitza la implementació tècnica d'interfícies configurades dinàmicament a través de tallers de codisseny. Presentem un marc de telemetria dissenyat per equilibrar les recomanacions automàtiques d'IA com els ajustaments manuals del docent en temps real.</w:t>
+        <w:t>- CA: Título: "Dynamic Interface Generation for Personalized Learning: A Co-design Case Study" | Resumen: Aquest article analitza la implementació tècnica d'interfícies configurades dinàmicament a través de tallers de codisseny. Presentem un marc de telemetria dissenyat per equilibrar las recomanacions automàtiques d'IA amb els ajustaments manuals del docent en tiempo real.</w:t>
       </w:r>
       <w:r>
         <w:br/>
@@ -2073,7 +2367,7 @@
         <w:t xml:space="preserve">Cita: </w:t>
       </w:r>
       <w:r>
-        <w:t xml:space="preserve">Vidal, S. &amp; Martínez, L. (2025). Ponencia en el Congreso Nacional de Investigación Educativa, Madrid. | </w:t>
+        <w:t xml:space="preserve">Negre, F., Lirola, F. &amp; Angulo, G. (2025). Ponencia en el Congreso Nacional de Investigación Educativa, Madrid. | </w:t>
       </w:r>
       <w:r>
         <w:rPr>
@@ -2082,7 +2376,7 @@
         <w:t xml:space="preserve">Zotero Key: </w:t>
       </w:r>
       <w:r>
-        <w:t xml:space="preserve">VID2025 | </w:t>
+        <w:t xml:space="preserve">NEG2025 | </w:t>
       </w:r>
       <w:r>
         <w:rPr>
@@ -2108,7 +2402,7 @@
       </w:r>
       <w:r>
         <w:br/>
-        <w:t>- CA: Título: "El rol del codisseny en el desenvolupament d'assistents virtuals intel·ligents per a secundària" | Resumen: Presentació de resultats del prototipat ràpid d'assistents intel·ligents en tres instituts de Mallorca, detallant la metodologia de codisseny per fases (exploració, co-creació, avaluació) i l'acollida dels quadres de comandament.</w:t>
+        <w:t>- CA: Título: "El rol del codisseny en el desenvolupament d'assistents virtuals intel·ligents per a secundària" | Resumen: Presentació de resultats del prototipat ràpid d'assistents intel·ligents en tres instituts de Mallorca, detallant la metodologia de codisseny per fases (exploración, co-creació, avaluació) y l'acollida dels quadres de comandament.</w:t>
       </w:r>
       <w:r>
         <w:br/>

</xml_diff>